<commit_message>
[week03] repro: 본인 노트북(Windows, MuJoCo 3.14.0) 재현 캡처 3장 + 결과 갱신
- 3종 스크립트 수치 동일. E2 초기 접촉 수만 버전별 차이(3.14: 1개, 3.15: 2개), 결론 동일
- 체크리스트 · log · 보고서의 '접촉 2개' 표기를 버전 무관하게 수정

Co-Authored-By: Claude Opus 5.5 <noreply@anthropic.com>
Claude-Session: https://claude.ai/code/session_01Foh4fEzP2BeNHBb7W7A6Fn
</commit_message>
<xml_diff>
--- a/members/park-jongjin/reports/학부생_주간활동보고서_3주차_박종진_22212289_20261008.docx
+++ b/members/park-jongjin/reports/학부생_주간활동보고서_3주차_박종진_22212289_20261008.docx
@@ -1091,7 +1091,7 @@
                 <w:sz w:val="16"/>
                 <w:szCs w:val="18"/>
               </w:rPr>
-              <w:t>② fusestatic — URDF 기본 true(MJCF false). joint 없는 정적 body를 부모에 합쳐 base_link · tool0의 이름·좌표계가 사라짐(body 5 → 3), 질량은 부모에 합산돼 동역학 동일(3.9731 Nm). 센서·툴 프레임, exclude·attach 대상이 필요하면 끈다. 2주차 "어깨가 안 떨어짐"은 fusestatic과 무관한 충돌 필터 예외로 문서 확인: 부모가 world(용접 포함)면 부모–자식 접촉을 거르지 않음 → exclude로 해결(접촉 2 → 0). (근거: compiler-fusestatic, Computation › Collision selection, 실험 E2·E3)</w:t>
+              <w:t>② fusestatic — URDF 기본 true(MJCF false). joint 없는 정적 body를 부모에 합쳐 base_link · tool0의 이름·좌표계가 사라짐(body 5 → 3), 질량은 부모에 합산돼 동역학 동일(3.9731 Nm). 센서·툴 프레임, exclude·attach 대상이 필요하면 끈다. 2주차 "어깨가 안 떨어짐"은 fusestatic과 무관한 충돌 필터 예외로 문서 확인: 부모가 world(용접 포함)면 부모–자식 접촉을 거르지 않음 → exclude로 해결(접촉 1~2개 → 0, 개수는 버전별 차이). (근거: compiler-fusestatic, Collision selection, 실험 E2·E3)</w:t>
             </w:r>
           </w:p>
           <w:p>
@@ -1656,12 +1656,8 @@
     </w:tbl>
     <w:p/>
     <w:p>
-      <w:r>
-        <w:br w:type="page"/>
-      </w:r>
-    </w:p>
-    <w:p>
       <w:pPr>
+        <w:pageBreakBefore/>
         <w:spacing w:after="60" w:line="276" w:lineRule="auto"/>
       </w:pPr>
       <w:r>
@@ -1790,6 +1786,18 @@
             </a:graphic>
           </wp:inline>
         </w:drawing>
+      </w:r>
+    </w:p>
+    <w:p>
+      <w:pPr>
+        <w:spacing w:after="60" w:line="276" w:lineRule="auto"/>
+      </w:pPr>
+      <w:r>
+        <w:rPr>
+          <w:b w:val="0"/>
+          <w:sz w:val="16"/>
+        </w:rPr>
+        <w:t>본인 노트북(Windows, MuJoCo 3.14.0)에서 스크립트 3종 재실행 — 수치 동일, 캡처 week03/img/repro/ 3장. 한글 경로에서 MuJoCo 파일 열기 실패를 발견해 scripts/mjio.py로 우회.</w:t>
       </w:r>
     </w:p>
     <w:p>

</xml_diff>

<commit_message>
[week03] reports: 3주차 보고서 제출본 (Word 1쪽 맞춤)
Co-Authored-By: Claude Opus 5.5 <noreply@anthropic.com>
Claude-Session: https://claude.ai/code/session_01Foh4fEzP2BeNHBb7W7A6Fn
</commit_message>
<xml_diff>
--- a/members/park-jongjin/reports/학부생_주간활동보고서_3주차_박종진_22212289_20261008.docx
+++ b/members/park-jongjin/reports/학부생_주간활동보고서_3주차_박종진_22212289_20261008.docx
@@ -1075,7 +1075,7 @@
                 <w:sz w:val="16"/>
                 <w:szCs w:val="18"/>
               </w:rPr>
-              <w:t>① 베이스 표현 — 루트 body에 joint가 없으면 world에 용접(고정, nv = 팔 관절 수). freejoint는 qpos 7 / qvel 6이 추가되고 바닥·바퀴 접촉이 있어야 선다. 홀로노믹은 slide x · slide y · hinge z + velocity 액추에이터(URDF planar 1개로 표현 가능). slide 축은 world 고정이라 90° 회전 뒤 base_x 0.3 m/s 명령이 옆걸음(world x 0.25 m) → 로봇 기준 명령은 R(yaw) 변환 필요. (근거: XML Reference freejoint, 실험 thu_loading_experiments.py E1·E5)</w:t>
+              <w:t>① 베이스 표현 — 루트 body에 joint가 없으면 world에 용접(고정, nv = 팔 관절 수). freejoint는 qpos 7 / qvel 6이 추가되고 바닥·바퀴 접촉이 있어야 선다. 홀로노믹은 slide x · slide y · hinge z + velocity 액추에이터(URDF planar 1개로 표현 가능). slide 축은 world 고정이라 90° 회전 뒤 base_x 0.3 m/s 명령이 옆걸음 → 로봇 기준 명령은 R(yaw) 변환 필요. (근거: freejoint 문서, 실험 E1·E5)</w:t>
             </w:r>
           </w:p>
           <w:p>
@@ -1091,7 +1091,7 @@
                 <w:sz w:val="16"/>
                 <w:szCs w:val="18"/>
               </w:rPr>
-              <w:t>② fusestatic — URDF 기본 true(MJCF false). joint 없는 정적 body를 부모에 합쳐 base_link · tool0의 이름·좌표계가 사라짐(body 5 → 3), 질량은 부모에 합산돼 동역학 동일(3.9731 Nm). 센서·툴 프레임, exclude·attach 대상이 필요하면 끈다. 2주차 "어깨가 안 떨어짐"은 fusestatic과 무관한 충돌 필터 예외로 문서 확인: 부모가 world(용접 포함)면 부모–자식 접촉을 거르지 않음 → exclude로 해결(접촉 1~2개 → 0, 개수는 버전별 차이). (근거: compiler-fusestatic, Collision selection, 실험 E2·E3)</w:t>
+              <w:t>② fusestatic — URDF 기본 true(MJCF false). joint 없는 정적 body를 부모에 합쳐 base_link · tool0의 이름·좌표계가 사라짐(body 5 → 3), 질량은 부모에 합산돼 동역학 동일(3.9731 Nm). 센서·툴 프레임, exclude·attach 대상이 필요하면 끈다. 2주차 "어깨가 안 떨어짐"은 fusestatic과 무관한 충돌 필터 예외로 문서 확인: 부모가 world(용접 포함)면 부모–자식 접촉을 거르지 않음 → exclude로 해결(접촉 → 0). (근거: fusestatic · Collision selection 문서, E2·E3)</w:t>
             </w:r>
           </w:p>
           <w:p>
@@ -1107,7 +1107,7 @@
                 <w:sz w:val="16"/>
                 <w:szCs w:val="18"/>
               </w:rPr>
-              <w:t>③ 구동 — position 힘 f = kp(ctrl − q) − kv·q̇, ωn = √(kp/M), ζ = (kv + b)/(2√(kp·M)); armature = J_rotor·N²가 M에 더해짐(0.142 → 0.292 kg·m²). 시뮬 오버슈트가 이론과 2~4 %p 이내 일치. MJCF 기본 각도는 degree라 angle="radian"을 빼면 ±1.5708이 ±1.5708°로 해석됨(실험 E4). (근거: actuator-position, body-joint-armature, wed_step_response.py)</w:t>
+              <w:t>③ 구동 — position 힘 f = kp(ctrl − q) − kv·q̇, ωn = √(kp/M), ζ = (kv + b)/(2√(kp·M)); armature = J_rotor·N²가 M에 더해짐(0.142 → 0.292 kg·m²). 시뮬 오버슈트가 이론과 2~4 %p 이내 일치. MJCF 기본 각도는 degree라 angle="radian"을 빼면 ±1.5708이 ±1.5708°로 해석됨(실험 E4). (근거: actuator-position · armature 문서, wed)</w:t>
             </w:r>
           </w:p>
         </w:tc>
@@ -1256,7 +1256,7 @@
               <w:rPr>
                 <w:sz w:val="16"/>
               </w:rPr>
-              <w:t>armature · forcerange 실제 값을 위해 BOM 구동기 사양(정격·피크 토크, 감속비, 로터 관성)을 4주차 BOM과 함께 받을 수 있을까요?</w:t>
+              <w:t>armature · forcerange용 BOM 구동기 사양(정격·피크 토크, 감속비, 로터 관성)을 4주차 BOM과 함께 받을 수 있을까요?</w:t>
             </w:r>
           </w:p>
         </w:tc>
@@ -1314,7 +1314,7 @@
               <w:rPr>
                 <w:sz w:val="16"/>
               </w:rPr>
-              <w:t>관성 삼각부등식 위반 처리(balanceinertia 기본 on/off)는 팀 의견이 갈려, 기준을 정해 주시면 체크리스트 B6에 반영하겠습니다.</w:t>
+              <w:t>balanceinertia(관성 삼각부등식 위반 처리) 기본 on/off 기준을 정해 주실 수 있을까요? (체크리스트 B6)</w:t>
             </w:r>
           </w:p>
         </w:tc>
@@ -1518,7 +1518,7 @@
               <w:rPr>
                 <w:sz w:val="16"/>
               </w:rPr>
-              <w:t>STEP 어셈블리 링크 분할표 작성 — ICD 이름 규칙 {side}_{부위}_{운동} ↔ STEP 부품 ↔ BOM 항목 (액추에이터 내부 부품은 한 강체로 묶음)</w:t>
+              <w:t>STEP 링크 분할표 — ICD 이름 {side}_{부위}_{운동} ↔ STEP 부품 ↔ BOM (액추에이터 내부는 한 강체)</w:t>
             </w:r>
           </w:p>
         </w:tc>
@@ -1583,7 +1583,7 @@
               <w:rPr>
                 <w:sz w:val="16"/>
               </w:rPr>
-              <w:t>(개별) 우리 로봇 골격 URDF(link · joint · limit, 베이스 planar) + BOM 구동기 → effort · velocity · armature 표, 3주차 체크리스트로 자기 URDF 점검</w:t>
+              <w:t>(개별) 골격 URDF(link · joint · limit, 베이스 planar) + 구동기 → effort · velocity · armature 표, 체크리스트 점검</w:t>
             </w:r>
           </w:p>
         </w:tc>
@@ -1648,7 +1648,7 @@
               <w:rPr>
                 <w:sz w:val="16"/>
               </w:rPr>
-              <w:t>함태훈 메시 · inertial을 골격에 합쳐 v0 URDF를 MuJoCo로 열어 캡처, 구술 대비(CAD 좌표 → 부모 프레임 joint origin, 정격/피크 토크 ↔ forcerange · ctrlrange) — 마감 10/15(목), week04 태그</w:t>
+              <w:t>함태훈 메시 · inertial 합쳐 v0 URDF(3단 규약)를 MuJoCo로 로드 · 캡처, 구술 대비 — 마감 10/15(목), week04</w:t>
             </w:r>
           </w:p>
         </w:tc>

</xml_diff>